<commit_message>
Daily primary-chain refactor, synthetic consumer module, updated outputs and methodology
</commit_message>
<xml_diff>
--- a/Methodology.docx
+++ b/Methodology.docx
@@ -2675,6 +2675,156 @@
       </w:pPr>
       <w:r>
         <w:t>run_all_rw3.py and total_run_builder.py: updated to recursively include nested outputs and new directory schema in summaries and Total Run documents.</w:t>
+      </w:r>
+    </w:p>
+    <w:p/>
+    <w:p>
+      <w:pPr>
+        <w:pStyle w:val="Heading1"/>
+      </w:pPr>
+      <w:r>
+        <w:t>14. Daily-Level Execution and Overlap Expansion (Latest Update)</w:t>
+      </w:r>
+    </w:p>
+    <w:p>
+      <w:r>
+        <w:t>All primary-chain econometric execution is now daily by default. Weekly is retained only as an optional robustness mode.</w:t>
+      </w:r>
+    </w:p>
+    <w:p>
+      <w:pPr>
+        <w:pStyle w:val="ListBullet"/>
+      </w:pPr>
+      <w:r>
+        <w:t>Primary pipeline frequency: daily (frequency_primary = daily in Rule_Documentation).</w:t>
+      </w:r>
+    </w:p>
+    <w:p>
+      <w:pPr>
+        <w:pStyle w:val="ListBullet"/>
+      </w:pPr>
+      <w:r>
+        <w:t>Lag profile scanning: daily lags 1..30 for correlation/lead-lag profiles.</w:t>
+      </w:r>
+    </w:p>
+    <w:p>
+      <w:pPr>
+        <w:pStyle w:val="ListBullet"/>
+      </w:pPr>
+      <w:r>
+        <w:t>Model lag search: capped at daily max lag 14 for computational reliability, with HAC robust errors and failover to smaller lag caps when needed.</w:t>
+      </w:r>
+    </w:p>
+    <w:p>
+      <w:pPr>
+        <w:pStyle w:val="ListBullet"/>
+      </w:pPr>
+      <w:r>
+        <w:t>Pairwise-overlap estimation: Producer-&gt;ProZorro and ProZorro-&gt;Retail are estimated on their own pair intersections, not strict triple intersection only.</w:t>
+      </w:r>
+    </w:p>
+    <w:p>
+      <w:pPr>
+        <w:pStyle w:val="ListBullet"/>
+      </w:pPr>
+      <w:r>
+        <w:t>VECM remains system-level and uses triple overlap only when admissible (I(1) and cointegration rank &gt; 0).</w:t>
+      </w:r>
+    </w:p>
+    <w:p>
+      <w:pPr>
+        <w:pStyle w:val="Heading2"/>
+      </w:pPr>
+      <w:r>
+        <w:t>14.1 Why n_obs improved</w:t>
+      </w:r>
+    </w:p>
+    <w:p>
+      <w:pPr>
+        <w:pStyle w:val="ListBullet"/>
+      </w:pPr>
+      <w:r>
+        <w:t>Previously, strict triple overlap produced very low n_obs in weekly samples (often around 8).</w:t>
+      </w:r>
+    </w:p>
+    <w:p>
+      <w:pPr>
+        <w:pStyle w:val="ListBullet"/>
+      </w:pPr>
+      <w:r>
+        <w:t>Now, link-specific pairwise intersections are used for pair models, while keeping chain interpretation explicit.</w:t>
+      </w:r>
+    </w:p>
+    <w:p>
+      <w:pPr>
+        <w:pStyle w:val="ListBullet"/>
+      </w:pPr>
+      <w:r>
+        <w:t>Daily alignment provides materially larger effective sample sizes for ARDL/ECM/NARDL in many standardized_type x retailer cases.</w:t>
+      </w:r>
+    </w:p>
+    <w:p>
+      <w:pPr>
+        <w:pStyle w:val="ListBullet"/>
+      </w:pPr>
+      <w:r>
+        <w:t>ModelEligibility now records pair-level sample sizes: n_obs_pair_prod_prozorro and n_obs_pair_prozorro_retail.</w:t>
+      </w:r>
+    </w:p>
+    <w:p>
+      <w:pPr>
+        <w:pStyle w:val="Heading2"/>
+      </w:pPr>
+      <w:r>
+        <w:t>14.2 Separate Post-Initial Module: Synthetic Consumer Over ProZorro Horizon</w:t>
+      </w:r>
+    </w:p>
+    <w:p>
+      <w:pPr>
+        <w:pStyle w:val="ListBullet"/>
+      </w:pPr>
+      <w:r>
+        <w:t>New separate module: model_synthetic_consumer.py (calls run_secondary_synthetic_consumer).</w:t>
+      </w:r>
+    </w:p>
+    <w:p>
+      <w:pPr>
+        <w:pStyle w:val="ListBullet"/>
+      </w:pPr>
+      <w:r>
+        <w:t>Output folder: outputs/secondary_synthetic_consumer/.</w:t>
+      </w:r>
+    </w:p>
+    <w:p>
+      <w:pPr>
+        <w:pStyle w:val="ListBullet"/>
+      </w:pPr>
+      <w:r>
+        <w:t>Core target: ultimate_consumer_price by standardized_type over each ProZorro available period.</w:t>
+      </w:r>
+    </w:p>
+    <w:p>
+      <w:pPr>
+        <w:pStyle w:val="ListBullet"/>
+      </w:pPr>
+      <w:r>
+        <w:t>Construction rule: combine ConsumerUA + Silpo + Novus after scaling Silpo/Novus to ConsumerUA overlap (median ratio calibration), then weighted blend with dynamic availability.</w:t>
+      </w:r>
+    </w:p>
+    <w:p>
+      <w:pPr>
+        <w:pStyle w:val="ListBullet"/>
+      </w:pPr>
+      <w:r>
+        <w:t>Main output sheets: SyntheticConsumer_Series, SyntheticConsumer_Models, SyntheticConsumer_PreTests, SyntheticConsumer_ResidualDiag, Scaling_Factors.</w:t>
+      </w:r>
+    </w:p>
+    <w:p>
+      <w:pPr>
+        <w:pStyle w:val="ListBullet"/>
+      </w:pPr>
+      <w:r>
+        <w:t>Models run separately from initial primary chain: Producer-&gt;ProZorro, ProZorro-&gt;UltimateConsumer, Producer-&gt;UltimateConsumer (ARDL/ECM where admissible).</w:t>
       </w:r>
     </w:p>
     <w:sectPr>

</xml_diff>